<commit_message>
feat(ui): redesign app shell and pages with SmartPark design system v7
- Add shared icon macros (_icons.html) with 70+ SVG icons and vehicle type helper
- Add reusable lot picker component (_lot_picker.html) with search, keyboard nav, capacity bars
- Overhaul style.css with new design tokens, light/dark themes, sidebar+topbar app shell, responsive layout
- Rebuild base.html with sidebar navigation, breadcrumbs, theme toggle, flash stack and footer
- Refactor all page templates (index, demo, parking_map, gate_booth, reports, report_detail, tables, sql_query, setup, error, simple_result) to use new components
- Update routes.py to fetch DiaChi, SucChua, SoLuongHienTai for lot picker and pass bai_list to index page
- Extend main.js with theme persistence, lot picker interactions, Vietnamese-diacritic-safe search, copy toast
- Update business specification document
</commit_message>
<xml_diff>
--- a/docs/Dac Ta Nghiep Vu - Updated.docx
+++ b/docs/Dac Ta Nghiep Vu - Updated.docx
@@ -1,6 +1,6 @@
 
 <file path=word/document.xml><?xml version="1.0" encoding="utf-8"?>
-<w:document xmlns:wpc="http://schemas.microsoft.com/office/word/2010/wordprocessingCanvas" xmlns:cx="http://schemas.microsoft.com/office/drawing/2014/chartex" xmlns:cx1="http://schemas.microsoft.com/office/drawing/2015/9/8/chartex" xmlns:mc="http://schemas.openxmlformats.org/markup-compatibility/2006" xmlns:o="urn:schemas-microsoft-com:office:office" xmlns:r="http://schemas.openxmlformats.org/officeDocument/2006/relationships" xmlns:m="http://schemas.openxmlformats.org/officeDocument/2006/math" xmlns:v="urn:schemas-microsoft-com:vml" xmlns:wp14="http://schemas.microsoft.com/office/word/2010/wordprocessingDrawing" xmlns:wp="http://schemas.openxmlformats.org/drawingml/2006/wordprocessingDrawing" xmlns:w10="urn:schemas-microsoft-com:office:word" xmlns:w="http://schemas.openxmlformats.org/wordprocessingml/2006/main" xmlns:w14="http://schemas.microsoft.com/office/word/2010/wordml" xmlns:w15="http://schemas.microsoft.com/office/word/2012/wordml" xmlns:w16se="http://schemas.microsoft.com/office/word/2015/wordml/symex" xmlns:wpg="http://schemas.microsoft.com/office/word/2010/wordprocessingGroup" xmlns:wpi="http://schemas.microsoft.com/office/word/2010/wordprocessingInk" xmlns:wne="http://schemas.microsoft.com/office/word/2006/wordml" xmlns:wps="http://schemas.microsoft.com/office/word/2010/wordprocessingShape" mc:Ignorable="w14 w15 w16se wp14">
+<w:document xmlns:wpc="http://schemas.microsoft.com/office/word/2010/wordprocessingCanvas" xmlns:cx="http://schemas.microsoft.com/office/drawing/2014/chartex" xmlns:cx1="http://schemas.microsoft.com/office/drawing/2015/9/8/chartex" xmlns:cx2="http://schemas.microsoft.com/office/drawing/2015/10/21/chartex" xmlns:cx3="http://schemas.microsoft.com/office/drawing/2016/5/9/chartex" xmlns:cx4="http://schemas.microsoft.com/office/drawing/2016/5/10/chartex" xmlns:cx5="http://schemas.microsoft.com/office/drawing/2016/5/11/chartex" xmlns:cx6="http://schemas.microsoft.com/office/drawing/2016/5/12/chartex" xmlns:cx7="http://schemas.microsoft.com/office/drawing/2016/5/13/chartex" xmlns:cx8="http://schemas.microsoft.com/office/drawing/2016/5/14/chartex" xmlns:mc="http://schemas.openxmlformats.org/markup-compatibility/2006" xmlns:aink="http://schemas.microsoft.com/office/drawing/2016/ink" xmlns:am3d="http://schemas.microsoft.com/office/drawing/2017/model3d" xmlns:o="urn:schemas-microsoft-com:office:office" xmlns:oel="http://schemas.microsoft.com/office/2019/extlst" xmlns:r="http://schemas.openxmlformats.org/officeDocument/2006/relationships" xmlns:m="http://schemas.openxmlformats.org/officeDocument/2006/math" xmlns:v="urn:schemas-microsoft-com:vml" xmlns:wp14="http://schemas.microsoft.com/office/word/2010/wordprocessingDrawing" xmlns:wp="http://schemas.openxmlformats.org/drawingml/2006/wordprocessingDrawing" xmlns:w10="urn:schemas-microsoft-com:office:word" xmlns:w="http://schemas.openxmlformats.org/wordprocessingml/2006/main" xmlns:w14="http://schemas.microsoft.com/office/word/2010/wordml" xmlns:w15="http://schemas.microsoft.com/office/word/2012/wordml" xmlns:w16cex="http://schemas.microsoft.com/office/word/2018/wordml/cex" xmlns:w16cid="http://schemas.microsoft.com/office/word/2016/wordml/cid" xmlns:w16="http://schemas.microsoft.com/office/word/2018/wordml" xmlns:w16du="http://schemas.microsoft.com/office/word/2023/wordml/word16du" xmlns:w16sdtdh="http://schemas.microsoft.com/office/word/2020/wordml/sdtdatahash" xmlns:w16sdtfl="http://schemas.microsoft.com/office/word/2024/wordml/sdtformatlock" xmlns:w16se="http://schemas.microsoft.com/office/word/2015/wordml/symex" xmlns:wpg="http://schemas.microsoft.com/office/word/2010/wordprocessingGroup" xmlns:wpi="http://schemas.microsoft.com/office/word/2010/wordprocessingInk" xmlns:wne="http://schemas.microsoft.com/office/word/2006/wordml" xmlns:wps="http://schemas.microsoft.com/office/word/2010/wordprocessingShape" mc:Ignorable="w14 w15 w16se w16cid w16 w16cex w16sdtdh w16sdtfl w16du wp14">
   <w:body>
     <w:p>
       <w:pPr>
@@ -71,7 +71,25 @@
           <w:szCs w:val="24"/>
           <w:lang w:eastAsia="vi-VN"/>
         </w:rPr>
-        <w:t>Trong hoạt động vận hành chuỗi nhiều bãi đỗ xe thuộc các địa bàn khác nhau (Quận 1, Quận 3, Bình Thạnh), việc quản lý ô đỗ, thẻ chip, lượt xe ra vào, vé tháng, biểu phí theo từng bãi và theo dõi sức chứa thời gian thực là nghiệp vụ cốt lõi, ảnh hưởng trực tiếp đến hiệu quả vận hành, doanh thu và an ninh. Nếu quản lý thủ công bằng sổ sách hoặc file Excel rời rạc, rất dễ xảy ra các vấn đề như sai lệch số lượng xe đang đỗ, khó kiểm soát chỗ trống theo loại phương tiện, khó tính phí lũy tiến chính xác, khó tra cứu lịch sử vào/ra, khó cảnh báo vé tháng sắp hết hạn và khó đối soát sự cố (mất thẻ, va quẹt…).</w:t>
+        <w:t>Trong hoạt động vận hành chuỗi nhiều bãi đỗ xe thuộc các địa bàn khác nhau (Quận 1, Quận 3, Bình Thạnh</w:t>
+      </w:r>
+      <w:r>
+        <w:rPr>
+          <w:rFonts w:ascii="Times New Roman" w:eastAsia="Times New Roman" w:hAnsi="Times New Roman" w:cs="Times New Roman"/>
+          <w:sz w:val="24"/>
+          <w:szCs w:val="24"/>
+          <w:lang w:val="en-US" w:eastAsia="vi-VN"/>
+        </w:rPr>
+        <w:t>,…</w:t>
+      </w:r>
+      <w:r>
+        <w:rPr>
+          <w:rFonts w:ascii="Times New Roman" w:eastAsia="Times New Roman" w:hAnsi="Times New Roman" w:cs="Times New Roman"/>
+          <w:sz w:val="24"/>
+          <w:szCs w:val="24"/>
+          <w:lang w:eastAsia="vi-VN"/>
+        </w:rPr>
+        <w:t>), việc quản lý ô đỗ, thẻ chip, lượt xe ra vào, vé tháng, biểu phí theo từng bãi và theo dõi sức chứa thời gian thực là nghiệp vụ cốt lõi, ảnh hưởng trực tiếp đến hiệu quả vận hành, doanh thu và an ninh. Nếu quản lý thủ công bằng sổ sách hoặc file Excel rời rạc, rất dễ xảy ra các vấn đề như sai lệch số lượng xe đang đỗ, khó kiểm soát chỗ trống theo loại phương tiện, khó tính phí lũy tiến chính xác, khó tra cứu lịch sử vào/ra, khó cảnh báo vé tháng sắp hết hạn và khó đối soát sự cố (mất thẻ, va quẹt…).</w:t>
       </w:r>
     </w:p>
     <w:p>
@@ -2686,8 +2704,6 @@
         </w:rPr>
         <w:t>/ Đã giải quyết.</w:t>
       </w:r>
-      <w:bookmarkStart w:id="0" w:name="_GoBack"/>
-      <w:bookmarkEnd w:id="0"/>
     </w:p>
     <w:p>
       <w:pPr>
@@ -3555,7 +3571,7 @@
 </file>
 
 <file path=word/numbering.xml><?xml version="1.0" encoding="utf-8"?>
-<w:numbering xmlns:wpc="http://schemas.microsoft.com/office/word/2010/wordprocessingCanvas" xmlns:cx="http://schemas.microsoft.com/office/drawing/2014/chartex" xmlns:cx1="http://schemas.microsoft.com/office/drawing/2015/9/8/chartex" xmlns:mc="http://schemas.openxmlformats.org/markup-compatibility/2006" xmlns:o="urn:schemas-microsoft-com:office:office" xmlns:r="http://schemas.openxmlformats.org/officeDocument/2006/relationships" xmlns:m="http://schemas.openxmlformats.org/officeDocument/2006/math" xmlns:v="urn:schemas-microsoft-com:vml" xmlns:wp14="http://schemas.microsoft.com/office/word/2010/wordprocessingDrawing" xmlns:wp="http://schemas.openxmlformats.org/drawingml/2006/wordprocessingDrawing" xmlns:w10="urn:schemas-microsoft-com:office:word" xmlns:w="http://schemas.openxmlformats.org/wordprocessingml/2006/main" xmlns:w14="http://schemas.microsoft.com/office/word/2010/wordml" xmlns:w15="http://schemas.microsoft.com/office/word/2012/wordml" xmlns:w16se="http://schemas.microsoft.com/office/word/2015/wordml/symex" xmlns:wpg="http://schemas.microsoft.com/office/word/2010/wordprocessingGroup" xmlns:wpi="http://schemas.microsoft.com/office/word/2010/wordprocessingInk" xmlns:wne="http://schemas.microsoft.com/office/word/2006/wordml" xmlns:wps="http://schemas.microsoft.com/office/word/2010/wordprocessingShape" mc:Ignorable="w14 w15 w16se wp14">
+<w:numbering xmlns:wpc="http://schemas.microsoft.com/office/word/2010/wordprocessingCanvas" xmlns:cx="http://schemas.microsoft.com/office/drawing/2014/chartex" xmlns:cx1="http://schemas.microsoft.com/office/drawing/2015/9/8/chartex" xmlns:cx2="http://schemas.microsoft.com/office/drawing/2015/10/21/chartex" xmlns:cx3="http://schemas.microsoft.com/office/drawing/2016/5/9/chartex" xmlns:cx4="http://schemas.microsoft.com/office/drawing/2016/5/10/chartex" xmlns:cx5="http://schemas.microsoft.com/office/drawing/2016/5/11/chartex" xmlns:cx6="http://schemas.microsoft.com/office/drawing/2016/5/12/chartex" xmlns:cx7="http://schemas.microsoft.com/office/drawing/2016/5/13/chartex" xmlns:cx8="http://schemas.microsoft.com/office/drawing/2016/5/14/chartex" xmlns:mc="http://schemas.openxmlformats.org/markup-compatibility/2006" xmlns:aink="http://schemas.microsoft.com/office/drawing/2016/ink" xmlns:am3d="http://schemas.microsoft.com/office/drawing/2017/model3d" xmlns:o="urn:schemas-microsoft-com:office:office" xmlns:oel="http://schemas.microsoft.com/office/2019/extlst" xmlns:r="http://schemas.openxmlformats.org/officeDocument/2006/relationships" xmlns:m="http://schemas.openxmlformats.org/officeDocument/2006/math" xmlns:v="urn:schemas-microsoft-com:vml" xmlns:wp14="http://schemas.microsoft.com/office/word/2010/wordprocessingDrawing" xmlns:wp="http://schemas.openxmlformats.org/drawingml/2006/wordprocessingDrawing" xmlns:w10="urn:schemas-microsoft-com:office:word" xmlns:w="http://schemas.openxmlformats.org/wordprocessingml/2006/main" xmlns:w14="http://schemas.microsoft.com/office/word/2010/wordml" xmlns:w15="http://schemas.microsoft.com/office/word/2012/wordml" xmlns:w16cex="http://schemas.microsoft.com/office/word/2018/wordml/cex" xmlns:w16cid="http://schemas.microsoft.com/office/word/2016/wordml/cid" xmlns:w16="http://schemas.microsoft.com/office/word/2018/wordml" xmlns:w16du="http://schemas.microsoft.com/office/word/2023/wordml/word16du" xmlns:w16sdtdh="http://schemas.microsoft.com/office/word/2020/wordml/sdtdatahash" xmlns:w16sdtfl="http://schemas.microsoft.com/office/word/2024/wordml/sdtformatlock" xmlns:w16se="http://schemas.microsoft.com/office/word/2015/wordml/symex" xmlns:wpg="http://schemas.microsoft.com/office/word/2010/wordprocessingGroup" xmlns:wpi="http://schemas.microsoft.com/office/word/2010/wordprocessingInk" xmlns:wne="http://schemas.microsoft.com/office/word/2006/wordml" xmlns:wps="http://schemas.microsoft.com/office/word/2010/wordprocessingShape" mc:Ignorable="w14 w15 w16se w16cid w16 w16cex w16sdtdh w16sdtfl w16du wp14">
   <w:abstractNum w:abstractNumId="0" w15:restartNumberingAfterBreak="0">
     <w:nsid w:val="02F23019"/>
     <w:multiLevelType w:val="multilevel"/>
@@ -7703,98 +7719,98 @@
       </w:rPr>
     </w:lvl>
   </w:abstractNum>
-  <w:num w:numId="1">
+  <w:num w:numId="1" w16cid:durableId="1053505569">
     <w:abstractNumId w:val="5"/>
   </w:num>
-  <w:num w:numId="2">
+  <w:num w:numId="2" w16cid:durableId="707416672">
     <w:abstractNumId w:val="4"/>
   </w:num>
-  <w:num w:numId="3">
+  <w:num w:numId="3" w16cid:durableId="1467354088">
     <w:abstractNumId w:val="15"/>
   </w:num>
-  <w:num w:numId="4">
+  <w:num w:numId="4" w16cid:durableId="799804131">
     <w:abstractNumId w:val="9"/>
   </w:num>
-  <w:num w:numId="5">
+  <w:num w:numId="5" w16cid:durableId="1680888173">
     <w:abstractNumId w:val="27"/>
   </w:num>
-  <w:num w:numId="6">
+  <w:num w:numId="6" w16cid:durableId="1603343820">
     <w:abstractNumId w:val="13"/>
   </w:num>
-  <w:num w:numId="7">
+  <w:num w:numId="7" w16cid:durableId="1672562962">
     <w:abstractNumId w:val="0"/>
   </w:num>
-  <w:num w:numId="8">
+  <w:num w:numId="8" w16cid:durableId="926379188">
     <w:abstractNumId w:val="11"/>
   </w:num>
-  <w:num w:numId="9">
+  <w:num w:numId="9" w16cid:durableId="496768300">
     <w:abstractNumId w:val="6"/>
   </w:num>
-  <w:num w:numId="10">
+  <w:num w:numId="10" w16cid:durableId="335035644">
     <w:abstractNumId w:val="25"/>
   </w:num>
-  <w:num w:numId="11">
+  <w:num w:numId="11" w16cid:durableId="472481278">
     <w:abstractNumId w:val="14"/>
   </w:num>
-  <w:num w:numId="12">
+  <w:num w:numId="12" w16cid:durableId="288433441">
     <w:abstractNumId w:val="16"/>
   </w:num>
-  <w:num w:numId="13">
+  <w:num w:numId="13" w16cid:durableId="556864218">
     <w:abstractNumId w:val="18"/>
   </w:num>
-  <w:num w:numId="14">
+  <w:num w:numId="14" w16cid:durableId="1321227445">
     <w:abstractNumId w:val="20"/>
   </w:num>
-  <w:num w:numId="15">
+  <w:num w:numId="15" w16cid:durableId="1131171926">
     <w:abstractNumId w:val="7"/>
   </w:num>
-  <w:num w:numId="16">
+  <w:num w:numId="16" w16cid:durableId="1943220966">
     <w:abstractNumId w:val="23"/>
   </w:num>
-  <w:num w:numId="17">
+  <w:num w:numId="17" w16cid:durableId="788399210">
     <w:abstractNumId w:val="10"/>
   </w:num>
-  <w:num w:numId="18">
+  <w:num w:numId="18" w16cid:durableId="1428044075">
     <w:abstractNumId w:val="12"/>
   </w:num>
-  <w:num w:numId="19">
+  <w:num w:numId="19" w16cid:durableId="1844512923">
     <w:abstractNumId w:val="19"/>
   </w:num>
-  <w:num w:numId="20">
+  <w:num w:numId="20" w16cid:durableId="1332298373">
     <w:abstractNumId w:val="3"/>
   </w:num>
-  <w:num w:numId="21">
+  <w:num w:numId="21" w16cid:durableId="1135752273">
     <w:abstractNumId w:val="28"/>
   </w:num>
-  <w:num w:numId="22">
+  <w:num w:numId="22" w16cid:durableId="1307081060">
     <w:abstractNumId w:val="22"/>
   </w:num>
-  <w:num w:numId="23">
+  <w:num w:numId="23" w16cid:durableId="1822043566">
     <w:abstractNumId w:val="1"/>
   </w:num>
-  <w:num w:numId="24">
+  <w:num w:numId="24" w16cid:durableId="672024971">
     <w:abstractNumId w:val="21"/>
   </w:num>
-  <w:num w:numId="25">
+  <w:num w:numId="25" w16cid:durableId="1056468290">
     <w:abstractNumId w:val="26"/>
   </w:num>
-  <w:num w:numId="26">
+  <w:num w:numId="26" w16cid:durableId="609816915">
     <w:abstractNumId w:val="8"/>
   </w:num>
-  <w:num w:numId="27">
+  <w:num w:numId="27" w16cid:durableId="699860354">
     <w:abstractNumId w:val="2"/>
   </w:num>
-  <w:num w:numId="28">
+  <w:num w:numId="28" w16cid:durableId="1049234">
     <w:abstractNumId w:val="24"/>
   </w:num>
-  <w:num w:numId="29">
+  <w:num w:numId="29" w16cid:durableId="42102512">
     <w:abstractNumId w:val="17"/>
   </w:num>
 </w:numbering>
 </file>
 
 <file path=word/styles.xml><?xml version="1.0" encoding="utf-8"?>
-<w:styles xmlns:mc="http://schemas.openxmlformats.org/markup-compatibility/2006" xmlns:r="http://schemas.openxmlformats.org/officeDocument/2006/relationships" xmlns:w="http://schemas.openxmlformats.org/wordprocessingml/2006/main" xmlns:w14="http://schemas.microsoft.com/office/word/2010/wordml" xmlns:w15="http://schemas.microsoft.com/office/word/2012/wordml" xmlns:w16se="http://schemas.microsoft.com/office/word/2015/wordml/symex" mc:Ignorable="w14 w15 w16se">
+<w:styles xmlns:mc="http://schemas.openxmlformats.org/markup-compatibility/2006" xmlns:r="http://schemas.openxmlformats.org/officeDocument/2006/relationships" xmlns:w="http://schemas.openxmlformats.org/wordprocessingml/2006/main" xmlns:w14="http://schemas.microsoft.com/office/word/2010/wordml" xmlns:w15="http://schemas.microsoft.com/office/word/2012/wordml" xmlns:w16cex="http://schemas.microsoft.com/office/word/2018/wordml/cex" xmlns:w16cid="http://schemas.microsoft.com/office/word/2016/wordml/cid" xmlns:w16="http://schemas.microsoft.com/office/word/2018/wordml" xmlns:w16du="http://schemas.microsoft.com/office/word/2023/wordml/word16du" xmlns:w16sdtdh="http://schemas.microsoft.com/office/word/2020/wordml/sdtdatahash" xmlns:w16sdtfl="http://schemas.microsoft.com/office/word/2024/wordml/sdtformatlock" xmlns:w16se="http://schemas.microsoft.com/office/word/2015/wordml/symex" mc:Ignorable="w14 w15 w16se w16cid w16 w16cex w16sdtdh w16sdtfl w16du">
   <w:docDefaults>
     <w:rPrDefault>
       <w:rPr>
@@ -7810,7 +7826,7 @@
       </w:pPr>
     </w:pPrDefault>
   </w:docDefaults>
-  <w:latentStyles w:defLockedState="0" w:defUIPriority="99" w:defSemiHidden="0" w:defUnhideWhenUsed="0" w:defQFormat="0" w:count="371">
+  <w:latentStyles w:defLockedState="0" w:defUIPriority="99" w:defSemiHidden="0" w:defUnhideWhenUsed="0" w:defQFormat="0" w:count="376">
     <w:lsdException w:name="Normal" w:uiPriority="0" w:qFormat="1"/>
     <w:lsdException w:name="heading 1" w:uiPriority="9" w:qFormat="1"/>
     <w:lsdException w:name="heading 2" w:semiHidden="1" w:uiPriority="9" w:unhideWhenUsed="1" w:qFormat="1"/>
@@ -8182,6 +8198,11 @@
     <w:lsdException w:name="List Table 5 Dark Accent 6" w:uiPriority="50"/>
     <w:lsdException w:name="List Table 6 Colorful Accent 6" w:uiPriority="51"/>
     <w:lsdException w:name="List Table 7 Colorful Accent 6" w:uiPriority="52"/>
+    <w:lsdException w:name="Mention" w:semiHidden="1" w:unhideWhenUsed="1"/>
+    <w:lsdException w:name="Smart Hyperlink" w:semiHidden="1" w:unhideWhenUsed="1"/>
+    <w:lsdException w:name="Hashtag" w:semiHidden="1" w:unhideWhenUsed="1"/>
+    <w:lsdException w:name="Unresolved Mention" w:semiHidden="1" w:unhideWhenUsed="1"/>
+    <w:lsdException w:name="Smart Link" w:semiHidden="1" w:unhideWhenUsed="1"/>
   </w:latentStyles>
   <w:style w:type="paragraph" w:default="1" w:styleId="Normal">
     <w:name w:val="Normal"/>

</xml_diff>